<commit_message>
Updated project with latest changes
</commit_message>
<xml_diff>
--- a/review docs/my Project Progress.docx
+++ b/review docs/my Project Progress.docx
@@ -138,7 +138,13 @@
         <w:rPr>
           <w:rFonts w:ascii="Times New Roman" w:hAnsi="Times New Roman" w:cs="Times New Roman"/>
         </w:rPr>
-        <w:t>II MCA</w:t>
+        <w:t>MCA</w:t>
+      </w:r>
+      <w:r>
+        <w:rPr>
+          <w:rFonts w:ascii="Times New Roman" w:hAnsi="Times New Roman" w:cs="Times New Roman"/>
+        </w:rPr>
+        <w:t xml:space="preserve"> IV SEM</w:t>
       </w:r>
       <w:r>
         <w:rPr>
@@ -212,7 +218,14 @@
         <w:rPr>
           <w:rFonts w:ascii="Times New Roman" w:hAnsi="Times New Roman" w:cs="Times New Roman"/>
         </w:rPr>
-        <w:t xml:space="preserve"> MCA., M. Tech.</w:t>
+        <w:t xml:space="preserve"> </w:t>
+      </w:r>
+      <w:r>
+        <w:rPr>
+          <w:rFonts w:ascii="Times New Roman" w:hAnsi="Times New Roman" w:cs="Times New Roman"/>
+          <w:vertAlign w:val="subscript"/>
+        </w:rPr>
+        <w:t>MCA., M. Tech.</w:t>
       </w:r>
       <w:r>
         <w:rPr>
@@ -328,7 +341,31 @@
           <w:sz w:val="24"/>
           <w:szCs w:val="24"/>
         </w:rPr>
-        <w:t>” is being carried out as part of the academic curriculum. The work completed so far includes problem identification, requirement analysis, system design, and partial implementation of the project.</w:t>
+        <w:t>” is being carried out as part of the academic curriculum. The work completed so far includes problem identification, requirement analysis, system design</w:t>
+      </w:r>
+      <w:r>
+        <w:rPr>
+          <w:rFonts w:ascii="Times New Roman" w:hAnsi="Times New Roman" w:cs="Times New Roman"/>
+          <w:sz w:val="24"/>
+          <w:szCs w:val="24"/>
+        </w:rPr>
+        <w:t xml:space="preserve">, frontend, backend and integration with database </w:t>
+      </w:r>
+      <w:r>
+        <w:rPr>
+          <w:rFonts w:ascii="Times New Roman" w:hAnsi="Times New Roman" w:cs="Times New Roman"/>
+          <w:sz w:val="24"/>
+          <w:szCs w:val="24"/>
+        </w:rPr>
+        <w:t xml:space="preserve">of </w:t>
+      </w:r>
+      <w:r>
+        <w:rPr>
+          <w:rFonts w:ascii="Times New Roman" w:hAnsi="Times New Roman" w:cs="Times New Roman"/>
+          <w:sz w:val="24"/>
+          <w:szCs w:val="24"/>
+        </w:rPr>
+        <w:t>project</w:t>
       </w:r>
       <w:r>
         <w:rPr>
@@ -345,7 +382,23 @@
           <w:szCs w:val="24"/>
         </w:rPr>
         <w:br/>
-        <w:t>As of the date of submission, approximately _____ % of the total project work has been completed under the guidance of the project guide. The remaining work includes completion of pending modules, integration, testing, documentation, and final project demonstration.</w:t>
+        <w:t>As of the date of submission, approximately _____ % of the total project work has been completed under the guidance of the project guide. The remaining work includes completion of pen</w:t>
+      </w:r>
+      <w:r>
+        <w:rPr>
+          <w:rFonts w:ascii="Times New Roman" w:hAnsi="Times New Roman" w:cs="Times New Roman"/>
+          <w:sz w:val="24"/>
+          <w:szCs w:val="24"/>
+        </w:rPr>
+        <w:t>ding modules</w:t>
+      </w:r>
+      <w:r>
+        <w:rPr>
+          <w:rFonts w:ascii="Times New Roman" w:hAnsi="Times New Roman" w:cs="Times New Roman"/>
+          <w:sz w:val="24"/>
+          <w:szCs w:val="24"/>
+        </w:rPr>
+        <w:t>, testing, documentation, and final project demonstration.</w:t>
       </w:r>
       <w:r>
         <w:rPr>

</xml_diff>